<commit_message>
Week05e demos and Lecture 9 updated
</commit_message>
<xml_diff>
--- a/exams/midterm_1_45632spring2026.docx
+++ b/exams/midterm_1_45632spring2026.docx
@@ -1357,6 +1357,269 @@
                 <w:szCs w:val="24"/>
               </w:rPr>
             </w:pPr>
+            <m:oMath>
+              <m:r>
+                <w:rPr>
+                  <w:rFonts w:ascii="Cambria Math" w:hAnsi="Cambria Math"/>
+                  <w:sz w:val="24"/>
+                  <w:szCs w:val="24"/>
+                </w:rPr>
+                <m:t>ω=2π</m:t>
+              </m:r>
+              <m:f>
+                <m:fPr>
+                  <m:type m:val="lin"/>
+                  <m:ctrlPr>
+                    <w:rPr>
+                      <w:rFonts w:ascii="Cambria Math" w:hAnsi="Cambria Math"/>
+                      <w:i/>
+                      <w:sz w:val="24"/>
+                      <w:szCs w:val="24"/>
+                    </w:rPr>
+                  </m:ctrlPr>
+                </m:fPr>
+                <m:num>
+                  <m:r>
+                    <w:rPr>
+                      <w:rFonts w:ascii="Cambria Math" w:hAnsi="Cambria Math"/>
+                      <w:sz w:val="24"/>
+                      <w:szCs w:val="24"/>
+                    </w:rPr>
+                    <m:t>f</m:t>
+                  </m:r>
+                </m:num>
+                <m:den>
+                  <m:sSub>
+                    <m:sSubPr>
+                      <m:ctrlPr>
+                        <w:rPr>
+                          <w:rFonts w:ascii="Cambria Math" w:hAnsi="Cambria Math"/>
+                          <w:i/>
+                          <w:sz w:val="24"/>
+                          <w:szCs w:val="24"/>
+                        </w:rPr>
+                      </m:ctrlPr>
+                    </m:sSubPr>
+                    <m:e>
+                      <m:r>
+                        <w:rPr>
+                          <w:rFonts w:ascii="Cambria Math" w:hAnsi="Cambria Math"/>
+                          <w:sz w:val="24"/>
+                          <w:szCs w:val="24"/>
+                        </w:rPr>
+                        <m:t>f</m:t>
+                      </m:r>
+                    </m:e>
+                    <m:sub>
+                      <m:r>
+                        <w:rPr>
+                          <w:rFonts w:ascii="Cambria Math" w:hAnsi="Cambria Math"/>
+                          <w:sz w:val="24"/>
+                          <w:szCs w:val="24"/>
+                        </w:rPr>
+                        <m:t>s</m:t>
+                      </m:r>
+                    </m:sub>
+                  </m:sSub>
+                </m:den>
+              </m:f>
+            </m:oMath>
+            <w:r>
+              <w:rPr>
+                <w:sz w:val="24"/>
+                <w:szCs w:val="24"/>
+              </w:rPr>
+              <w:t xml:space="preserve"> modulo </w:t>
+            </w:r>
+            <m:oMath>
+              <m:r>
+                <w:rPr>
+                  <w:rFonts w:ascii="Cambria Math" w:hAnsi="Cambria Math"/>
+                  <w:sz w:val="24"/>
+                  <w:szCs w:val="24"/>
+                </w:rPr>
+                <m:t>2π</m:t>
+              </m:r>
+            </m:oMath>
+            <w:r>
+              <w:rPr>
+                <w:sz w:val="24"/>
+                <w:szCs w:val="24"/>
+              </w:rPr>
+              <w:t xml:space="preserve">      </w:t>
+            </w:r>
+            <m:oMath>
+              <m:sSub>
+                <m:sSubPr>
+                  <m:ctrlPr>
+                    <w:rPr>
+                      <w:rFonts w:ascii="Cambria Math" w:hAnsi="Cambria Math"/>
+                      <w:i/>
+                      <w:sz w:val="24"/>
+                      <w:szCs w:val="24"/>
+                    </w:rPr>
+                  </m:ctrlPr>
+                </m:sSubPr>
+                <m:e>
+                  <m:r>
+                    <w:rPr>
+                      <w:rFonts w:ascii="Cambria Math" w:hAnsi="Cambria Math"/>
+                      <w:sz w:val="24"/>
+                      <w:szCs w:val="24"/>
+                    </w:rPr>
+                    <m:t>f</m:t>
+                  </m:r>
+                </m:e>
+                <m:sub>
+                  <m:r>
+                    <w:rPr>
+                      <w:rFonts w:ascii="Cambria Math" w:hAnsi="Cambria Math"/>
+                      <w:sz w:val="24"/>
+                      <w:szCs w:val="24"/>
+                    </w:rPr>
+                    <m:t>alias</m:t>
+                  </m:r>
+                </m:sub>
+              </m:sSub>
+              <m:r>
+                <w:rPr>
+                  <w:rFonts w:ascii="Cambria Math" w:hAnsi="Cambria Math"/>
+                  <w:sz w:val="24"/>
+                  <w:szCs w:val="24"/>
+                </w:rPr>
+                <m:t>=</m:t>
+              </m:r>
+              <m:d>
+                <m:dPr>
+                  <m:begChr m:val="|"/>
+                  <m:endChr m:val="|"/>
+                  <m:ctrlPr>
+                    <w:rPr>
+                      <w:rFonts w:ascii="Cambria Math" w:hAnsi="Cambria Math"/>
+                      <w:i/>
+                      <w:sz w:val="24"/>
+                      <w:szCs w:val="24"/>
+                    </w:rPr>
+                  </m:ctrlPr>
+                </m:dPr>
+                <m:e>
+                  <m:r>
+                    <w:rPr>
+                      <w:rFonts w:ascii="Cambria Math" w:hAnsi="Cambria Math"/>
+                      <w:sz w:val="24"/>
+                      <w:szCs w:val="24"/>
+                    </w:rPr>
+                    <m:t>f-k</m:t>
+                  </m:r>
+                  <m:sSub>
+                    <m:sSubPr>
+                      <m:ctrlPr>
+                        <w:rPr>
+                          <w:rFonts w:ascii="Cambria Math" w:hAnsi="Cambria Math"/>
+                          <w:i/>
+                          <w:sz w:val="24"/>
+                          <w:szCs w:val="24"/>
+                        </w:rPr>
+                      </m:ctrlPr>
+                    </m:sSubPr>
+                    <m:e>
+                      <m:r>
+                        <w:rPr>
+                          <w:rFonts w:ascii="Cambria Math" w:hAnsi="Cambria Math"/>
+                          <w:sz w:val="24"/>
+                          <w:szCs w:val="24"/>
+                        </w:rPr>
+                        <m:t>f</m:t>
+                      </m:r>
+                    </m:e>
+                    <m:sub>
+                      <m:r>
+                        <w:rPr>
+                          <w:rFonts w:ascii="Cambria Math" w:hAnsi="Cambria Math"/>
+                          <w:sz w:val="24"/>
+                          <w:szCs w:val="24"/>
+                        </w:rPr>
+                        <m:t>s</m:t>
+                      </m:r>
+                    </m:sub>
+                  </m:sSub>
+                </m:e>
+              </m:d>
+            </m:oMath>
+            <w:r>
+              <w:rPr>
+                <w:sz w:val="24"/>
+                <w:szCs w:val="24"/>
+              </w:rPr>
+              <w:t xml:space="preserve"> in </w:t>
+            </w:r>
+            <m:oMath>
+              <m:r>
+                <w:rPr>
+                  <w:rFonts w:ascii="Cambria Math" w:hAnsi="Cambria Math"/>
+                  <w:sz w:val="24"/>
+                  <w:szCs w:val="24"/>
+                </w:rPr>
+                <m:t>[0,</m:t>
+              </m:r>
+              <m:f>
+                <m:fPr>
+                  <m:type m:val="lin"/>
+                  <m:ctrlPr>
+                    <w:rPr>
+                      <w:rFonts w:ascii="Cambria Math" w:hAnsi="Cambria Math"/>
+                      <w:i/>
+                      <w:sz w:val="24"/>
+                      <w:szCs w:val="24"/>
+                    </w:rPr>
+                  </m:ctrlPr>
+                </m:fPr>
+                <m:num>
+                  <m:sSub>
+                    <m:sSubPr>
+                      <m:ctrlPr>
+                        <w:rPr>
+                          <w:rFonts w:ascii="Cambria Math" w:hAnsi="Cambria Math"/>
+                          <w:i/>
+                          <w:sz w:val="24"/>
+                          <w:szCs w:val="24"/>
+                        </w:rPr>
+                      </m:ctrlPr>
+                    </m:sSubPr>
+                    <m:e>
+                      <m:r>
+                        <w:rPr>
+                          <w:rFonts w:ascii="Cambria Math" w:hAnsi="Cambria Math"/>
+                          <w:sz w:val="24"/>
+                          <w:szCs w:val="24"/>
+                        </w:rPr>
+                        <m:t>f</m:t>
+                      </m:r>
+                    </m:e>
+                    <m:sub>
+                      <m:r>
+                        <w:rPr>
+                          <w:rFonts w:ascii="Cambria Math" w:hAnsi="Cambria Math"/>
+                          <w:sz w:val="24"/>
+                          <w:szCs w:val="24"/>
+                        </w:rPr>
+                        <m:t>s</m:t>
+                      </m:r>
+                    </m:sub>
+                  </m:sSub>
+                </m:num>
+                <m:den>
+                  <m:r>
+                    <w:rPr>
+                      <w:rFonts w:ascii="Cambria Math" w:hAnsi="Cambria Math"/>
+                      <w:sz w:val="24"/>
+                      <w:szCs w:val="24"/>
+                    </w:rPr>
+                    <m:t>2]</m:t>
+                  </m:r>
+                </m:den>
+              </m:f>
+            </m:oMath>
           </w:p>
         </w:tc>
       </w:tr>
@@ -1397,6 +1660,129 @@
                 <w:szCs w:val="24"/>
               </w:rPr>
             </w:pPr>
+            <m:oMath>
+              <m:r>
+                <w:rPr>
+                  <w:rFonts w:ascii="Cambria Math" w:hAnsi="Cambria Math" w:cstheme="minorHAnsi"/>
+                  <w:sz w:val="24"/>
+                  <w:szCs w:val="24"/>
+                </w:rPr>
+                <m:t>∆≈</m:t>
+              </m:r>
+            </m:oMath>
+            <w:r>
+              <w:rPr>
+                <w:sz w:val="24"/>
+                <w:szCs w:val="24"/>
+              </w:rPr>
+              <w:t>full-scale range</w:t>
+            </w:r>
+            <m:oMath>
+              <m:r>
+                <w:rPr>
+                  <w:rFonts w:ascii="Cambria Math" w:hAnsi="Cambria Math"/>
+                  <w:sz w:val="24"/>
+                  <w:szCs w:val="24"/>
+                </w:rPr>
+                <m:t>/</m:t>
+              </m:r>
+              <m:sSup>
+                <m:sSupPr>
+                  <m:ctrlPr>
+                    <w:rPr>
+                      <w:rFonts w:ascii="Cambria Math" w:hAnsi="Cambria Math"/>
+                      <w:i/>
+                      <w:sz w:val="24"/>
+                      <w:szCs w:val="24"/>
+                    </w:rPr>
+                  </m:ctrlPr>
+                </m:sSupPr>
+                <m:e>
+                  <m:r>
+                    <w:rPr>
+                      <w:rFonts w:ascii="Cambria Math" w:hAnsi="Cambria Math"/>
+                      <w:sz w:val="24"/>
+                      <w:szCs w:val="24"/>
+                    </w:rPr>
+                    <m:t>2</m:t>
+                  </m:r>
+                </m:e>
+                <m:sup>
+                  <m:r>
+                    <w:rPr>
+                      <w:rFonts w:ascii="Cambria Math" w:hAnsi="Cambria Math"/>
+                      <w:sz w:val="24"/>
+                      <w:szCs w:val="24"/>
+                    </w:rPr>
+                    <m:t>B</m:t>
+                  </m:r>
+                </m:sup>
+              </m:sSup>
+            </m:oMath>
+            <w:r>
+              <w:rPr>
+                <w:sz w:val="24"/>
+                <w:szCs w:val="24"/>
+              </w:rPr>
+              <w:t xml:space="preserve">     </w:t>
+            </w:r>
+            <m:oMath>
+              <m:r>
+                <w:rPr>
+                  <w:rFonts w:ascii="Cambria Math" w:hAnsi="Cambria Math"/>
+                  <w:sz w:val="24"/>
+                  <w:szCs w:val="24"/>
+                </w:rPr>
+                <m:t>SQN</m:t>
+              </m:r>
+              <m:sSub>
+                <m:sSubPr>
+                  <m:ctrlPr>
+                    <w:rPr>
+                      <w:rFonts w:ascii="Cambria Math" w:hAnsi="Cambria Math"/>
+                      <w:i/>
+                      <w:sz w:val="24"/>
+                      <w:szCs w:val="24"/>
+                    </w:rPr>
+                  </m:ctrlPr>
+                </m:sSubPr>
+                <m:e>
+                  <m:r>
+                    <w:rPr>
+                      <w:rFonts w:ascii="Cambria Math" w:hAnsi="Cambria Math"/>
+                      <w:sz w:val="24"/>
+                      <w:szCs w:val="24"/>
+                    </w:rPr>
+                    <m:t>R</m:t>
+                  </m:r>
+                </m:e>
+                <m:sub>
+                  <m:r>
+                    <w:rPr>
+                      <w:rFonts w:ascii="Cambria Math" w:hAnsi="Cambria Math"/>
+                      <w:sz w:val="24"/>
+                      <w:szCs w:val="24"/>
+                    </w:rPr>
+                    <m:t>FSsine</m:t>
+                  </m:r>
+                </m:sub>
+              </m:sSub>
+              <m:r>
+                <w:rPr>
+                  <w:rFonts w:ascii="Cambria Math" w:hAnsi="Cambria Math"/>
+                  <w:sz w:val="24"/>
+                  <w:szCs w:val="24"/>
+                </w:rPr>
+                <m:t>≈6.02B+1.76</m:t>
+              </m:r>
+            </m:oMath>
+            <w:r>
+              <w:rPr>
+                <w:sz w:val="24"/>
+                <w:szCs w:val="24"/>
+              </w:rPr>
+              <w:t xml:space="preserve"> dB  </w:t>
+            </w:r>
           </w:p>
         </w:tc>
       </w:tr>
@@ -4953,7 +5339,7 @@
           <w:noProof/>
         </w:rPr>
         <w:drawing>
-          <wp:anchor distT="0" distB="0" distL="114300" distR="114300" simplePos="0" relativeHeight="251702272" behindDoc="0" locked="1" layoutInCell="1" allowOverlap="1" wp14:anchorId="019E7D87" wp14:editId="244014D8">
+          <wp:anchor distT="0" distB="0" distL="114300" distR="114300" simplePos="0" relativeHeight="251702272" behindDoc="0" locked="1" layoutInCell="1" allowOverlap="1" wp14:anchorId="019E7D87" wp14:editId="24FC230D">
             <wp:simplePos x="0" y="0"/>
             <wp:positionH relativeFrom="margin">
               <wp:align>right</wp:align>

</xml_diff>